<commit_message>
Docs, build prompt pack and feature-gap sheet updated to 0.9.1
- User's Guide, Quick Start, Technical System Design and Developer's Guide (Markdown and Word): macOS and Linux
  install, the platform design, the loose-date import fix
- Build prompt pack: version 0.9.1, release file names, arm64 Linux, the Linux universal-merge method, §6.16
- Feature-gap sheet: cross-platform done in 0.9.0, the import fix in 0.9.1

Co-Authored-By: Claude Opus 5.5 <noreply@anthropic.com>
Claude-Session: https://claude.ai/code/session_01KZ8RpfjgQtZthigNSkA5xL
</commit_message>
<xml_diff>
--- a/docs/word/quick-start.docx
+++ b/docs/word/quick-start.docx
@@ -7,7 +7,7 @@
         <w:pStyle w:val="Heading1"/>
       </w:pPr>
       <w:r>
-        <w:t xml:space="preserve">ReminderFoxAgain 0.8.1 — Quick Start</w:t>
+        <w:t xml:space="preserve">ReminderFoxAgain 0.9.1 — Quick Start</w:t>
       </w:r>
     </w:p>
     <w:p>
@@ -79,6 +79,84 @@
       </w:pPr>
       <w:r>
         <w:t xml:space="preserve">When it says it's done, ReminderFoxAgain starts. It also has a Start-menu and a desktop shortcut.</w:t>
+      </w:r>
+    </w:p>
+    <w:p>
+      <w:pPr/>
+      <w:r>
+        <w:t xml:space="preserve">The steps above are for Windows. </w:t>
+      </w:r>
+      <w:r>
+        <w:rPr>
+          <w:b/>
+        </w:rPr>
+        <w:t xml:space="preserve">On a Mac</w:t>
+      </w:r>
+      <w:r>
+        <w:t xml:space="preserve">, unzip </w:t>
+      </w:r>
+      <w:r>
+        <w:rPr>
+          <w:rStyle w:val="CodeChar"/>
+        </w:rPr>
+        <w:t xml:space="preserve">ReminderFoxAgain-0.9.1-macos-universal.zip</w:t>
+      </w:r>
+      <w:r>
+        <w:t xml:space="preserve">, drag the app into Applications, and open it once with System Settings → Privacy &amp; Security → </w:t>
+      </w:r>
+      <w:r>
+        <w:rPr>
+          <w:b/>
+        </w:rPr>
+        <w:t xml:space="preserve">Open Anyway</w:t>
+      </w:r>
+      <w:r>
+        <w:t xml:space="preserve"> (macOS 15 and later), or Control-click → </w:t>
+      </w:r>
+      <w:r>
+        <w:rPr>
+          <w:b/>
+        </w:rPr>
+        <w:t xml:space="preserve">Open</w:t>
+      </w:r>
+      <w:r>
+        <w:t xml:space="preserve"> (macOS 13–14). </w:t>
+      </w:r>
+      <w:r>
+        <w:rPr>
+          <w:b/>
+        </w:rPr>
+        <w:t xml:space="preserve">On Linux</w:t>
+      </w:r>
+      <w:r>
+        <w:t xml:space="preserve">, run </w:t>
+      </w:r>
+      <w:r>
+        <w:rPr>
+          <w:rStyle w:val="CodeChar"/>
+        </w:rPr>
+        <w:t xml:space="preserve">sudo apt install ./reminderfoxagain_0.9.1_amd64.deb</w:t>
+      </w:r>
+      <w:r>
+        <w:t xml:space="preserve">, or unpack the </w:t>
+      </w:r>
+      <w:r>
+        <w:rPr>
+          <w:rStyle w:val="CodeChar"/>
+        </w:rPr>
+        <w:t xml:space="preserve">.tar.gz</w:t>
+      </w:r>
+      <w:r>
+        <w:t xml:space="preserve"> and run </w:t>
+      </w:r>
+      <w:r>
+        <w:rPr>
+          <w:rStyle w:val="CodeChar"/>
+        </w:rPr>
+        <w:t xml:space="preserve">./install.sh</w:t>
+      </w:r>
+      <w:r>
+        <w:t xml:space="preserve">.</w:t>
       </w:r>
     </w:p>
     <w:p>

</xml_diff>

<commit_message>
ReminderFoxAgain 0.9.2: a standard Windows installer (NSIS)
- One file, ReminderFoxAgain-Setup-<ver>.exe, built on Linux with makensis: per user, no admin, same install folder,
  updates .bat-era installs in place, swaps folders with rollback, shortcuts and a Settings -> Apps entry
- A real uninstaller in the app's languages; asks before deleting your reminders (No by default; /S keeps them)
- No PowerShell, execution-policy bypass, part joining or Unblock-File
- tools/test-installer.sh (Wine) replaces tools/test-setup.sh; docs, build prompt pack and feature gaps updated

Co-Authored-By: Claude Opus 5.5 <noreply@anthropic.com>
Claude-Session: https://claude.ai/code/session_01KZ8RpfjgQtZthigNSkA5xL
</commit_message>
<xml_diff>
--- a/docs/word/quick-start.docx
+++ b/docs/word/quick-start.docx
@@ -7,7 +7,7 @@
         <w:pStyle w:val="Heading1"/>
       </w:pPr>
       <w:r>
-        <w:t xml:space="preserve">ReminderFoxAgain 0.9.1 — Quick Start</w:t>
+        <w:t xml:space="preserve">ReminderFoxAgain 0.9.2 — Quick Start</w:t>
       </w:r>
     </w:p>
     <w:p>
@@ -45,7 +45,17 @@
         </w:numPr>
       </w:pPr>
       <w:r>
-        <w:t xml:space="preserve">Put all the release files in one folder: the .bat, the .ps1, the .asar and the six runtime parts.</w:t>
+        <w:t xml:space="preserve">Download </w:t>
+      </w:r>
+      <w:r>
+        <w:rPr>
+          <w:b/>
+          <w:bCs/>
+        </w:rPr>
+        <w:t xml:space="preserve">ReminderFoxAgain-Setup-0.9.2.exe</w:t>
+      </w:r>
+      <w:r>
+        <w:t xml:space="preserve"> and run it. No administrator rights are needed.</w:t>
       </w:r>
     </w:p>
     <w:p>
@@ -57,16 +67,27 @@
         </w:numPr>
       </w:pPr>
       <w:r>
-        <w:t xml:space="preserve">Double-click </w:t>
-      </w:r>
-      <w:r>
-        <w:rPr>
-          <w:b/>
-        </w:rPr>
-        <w:t xml:space="preserve">Install or Update ReminderFoxAgain.bat</w:t>
-      </w:r>
-      <w:r>
-        <w:t xml:space="preserve">. No administrator rights are needed.</w:t>
+        <w:t xml:space="preserve">If Windows says "Windows protected your PC", choose </w:t>
+      </w:r>
+      <w:r>
+        <w:rPr>
+          <w:b/>
+          <w:bCs/>
+        </w:rPr>
+        <w:t xml:space="preserve">More info</w:t>
+      </w:r>
+      <w:r>
+        <w:t xml:space="preserve"> → </w:t>
+      </w:r>
+      <w:r>
+        <w:rPr>
+          <w:b/>
+          <w:bCs/>
+        </w:rPr>
+        <w:t xml:space="preserve">Run anyway</w:t>
+      </w:r>
+      <w:r>
+        <w:t xml:space="preserve">. The installer isn't code-signed yet.</w:t>
       </w:r>
     </w:p>
     <w:p>
@@ -78,7 +99,27 @@
         </w:numPr>
       </w:pPr>
       <w:r>
-        <w:t xml:space="preserve">When it says it's done, ReminderFoxAgain starts. It also has a Start-menu and a desktop shortcut.</w:t>
+        <w:t xml:space="preserve">Click </w:t>
+      </w:r>
+      <w:r>
+        <w:rPr>
+          <w:b/>
+          <w:bCs/>
+        </w:rPr>
+        <w:t xml:space="preserve">Install</w:t>
+      </w:r>
+      <w:r>
+        <w:t xml:space="preserve">, then </w:t>
+      </w:r>
+      <w:r>
+        <w:rPr>
+          <w:b/>
+          <w:bCs/>
+        </w:rPr>
+        <w:t xml:space="preserve">Finish</w:t>
+      </w:r>
+      <w:r>
+        <w:t xml:space="preserve">. ReminderFoxAgain starts, and it also has a Start-menu and a desktop shortcut.</w:t>
       </w:r>
     </w:p>
     <w:p>
@@ -89,6 +130,7 @@
       <w:r>
         <w:rPr>
           <w:b/>
+          <w:bCs/>
         </w:rPr>
         <w:t xml:space="preserve">On a Mac</w:t>
       </w:r>
@@ -99,7 +141,7 @@
         <w:rPr>
           <w:rStyle w:val="CodeChar"/>
         </w:rPr>
-        <w:t xml:space="preserve">ReminderFoxAgain-0.9.1-macos-universal.zip</w:t>
+        <w:t xml:space="preserve">ReminderFoxAgain-0.9.2-macos-universal.zip</w:t>
       </w:r>
       <w:r>
         <w:t xml:space="preserve">, drag the app into Applications, and open it once with System Settings → Privacy &amp; Security → </w:t>
@@ -107,6 +149,7 @@
       <w:r>
         <w:rPr>
           <w:b/>
+          <w:bCs/>
         </w:rPr>
         <w:t xml:space="preserve">Open Anyway</w:t>
       </w:r>
@@ -116,6 +159,7 @@
       <w:r>
         <w:rPr>
           <w:b/>
+          <w:bCs/>
         </w:rPr>
         <w:t xml:space="preserve">Open</w:t>
       </w:r>
@@ -125,6 +169,7 @@
       <w:r>
         <w:rPr>
           <w:b/>
+          <w:bCs/>
         </w:rPr>
         <w:t xml:space="preserve">On Linux</w:t>
       </w:r>
@@ -135,7 +180,7 @@
         <w:rPr>
           <w:rStyle w:val="CodeChar"/>
         </w:rPr>
-        <w:t xml:space="preserve">sudo apt install ./reminderfoxagain_0.9.1_amd64.deb</w:t>
+        <w:t xml:space="preserve">sudo apt install ./reminderfoxagain_0.9.2_amd64.deb</w:t>
       </w:r>
       <w:r>
         <w:t xml:space="preserve">, or unpack the </w:t>
@@ -162,7 +207,7 @@
     <w:p>
       <w:pPr/>
       <w:r>
-        <w:t xml:space="preserve">Already on 0.7.x? You only need the .bat, the .ps1 and the .asar. Coming from 0.6.x? Include the runtime parts too, so the date pickers speak your language. Your data is never touched by an update.</w:t>
+        <w:t xml:space="preserve">Already have ReminderFoxAgain? Run the new Setup file; it updates the installed copy, including one made by the earlier .bat setup. Your data is never touched by an update.</w:t>
       </w:r>
     </w:p>
     <w:p>
@@ -220,6 +265,7 @@
       <w:r>
         <w:rPr>
           <w:b/>
+          <w:bCs/>
         </w:rPr>
         <w:t xml:space="preserve">A. The app found your ReminderFox file</w:t>
       </w:r>
@@ -238,6 +284,7 @@
       <w:r>
         <w:rPr>
           <w:b/>
+          <w:bCs/>
         </w:rPr>
         <w:t xml:space="preserve">Import from your ReminderFox add-on</w:t>
       </w:r>
@@ -259,6 +306,7 @@
       <w:r>
         <w:rPr>
           <w:b/>
+          <w:bCs/>
         </w:rPr>
         <w:t xml:space="preserve">Import</w:t>
       </w:r>
@@ -268,6 +316,7 @@
       <w:r>
         <w:rPr>
           <w:b/>
+          <w:bCs/>
         </w:rPr>
         <w:t xml:space="preserve">Add to what I have</w:t>
       </w:r>
@@ -277,6 +326,7 @@
       <w:r>
         <w:rPr>
           <w:b/>
+          <w:bCs/>
         </w:rPr>
         <w:t xml:space="preserve">Skip</w:t>
       </w:r>
@@ -286,6 +336,7 @@
       <w:r>
         <w:rPr>
           <w:b/>
+          <w:bCs/>
         </w:rPr>
         <w:t xml:space="preserve">Import</w:t>
       </w:r>
@@ -355,6 +406,7 @@
       <w:r>
         <w:rPr>
           <w:b/>
+          <w:bCs/>
         </w:rPr>
         <w:t xml:space="preserve">B. You have the file somewhere else</w:t>
       </w:r>
@@ -385,6 +437,7 @@
       <w:r>
         <w:rPr>
           <w:b/>
+          <w:bCs/>
         </w:rPr>
         <w:t xml:space="preserve">Import a reminderfox.ics or other calendar file…</w:t>
       </w:r>
@@ -412,6 +465,7 @@
       <w:r>
         <w:rPr>
           <w:b/>
+          <w:bCs/>
         </w:rPr>
         <w:t xml:space="preserve">Import</w:t>
       </w:r>
@@ -421,6 +475,7 @@
       <w:r>
         <w:rPr>
           <w:b/>
+          <w:bCs/>
         </w:rPr>
         <w:t xml:space="preserve">Category</w:t>
       </w:r>
@@ -442,6 +497,7 @@
       <w:r>
         <w:rPr>
           <w:b/>
+          <w:bCs/>
         </w:rPr>
         <w:t xml:space="preserve">C. Where the add-on kept its file</w:t>
       </w:r>
@@ -508,6 +564,7 @@
       <w:r>
         <w:rPr>
           <w:b/>
+          <w:bCs/>
         </w:rPr>
         <w:t xml:space="preserve">(Ctrl+I) from Settings → Data → Import an .ics file… or</w:t>
       </w:r>
@@ -517,6 +574,7 @@
       <w:r>
         <w:rPr>
           <w:b/>
+          <w:bCs/>
         </w:rPr>
         <w:t xml:space="preserve">Import from ReminderFox…</w:t>
       </w:r>
@@ -546,6 +604,7 @@
       <w:r>
         <w:rPr>
           <w:b/>
+          <w:bCs/>
         </w:rPr>
         <w:t xml:space="preserve">Start with an empty list</w:t>
       </w:r>
@@ -573,6 +632,7 @@
       <w:r>
         <w:rPr>
           <w:b/>
+          <w:bCs/>
         </w:rPr>
         <w:t xml:space="preserve">from Settings → Data → Import an .ics file… (Ctrl+I)</w:t>
       </w:r>
@@ -593,6 +653,7 @@
       <w:r>
         <w:rPr>
           <w:i/>
+          <w:iCs/>
         </w:rPr>
         <w:t xml:space="preserve">Dentist appointment on Monday, Oct 26 at 2:30 PM, with an alarm an hour before.</w:t>
       </w:r>
@@ -611,6 +672,7 @@
       <w:r>
         <w:rPr>
           <w:b/>
+          <w:bCs/>
         </w:rPr>
         <w:t xml:space="preserve">＋ Reminder</w:t>
       </w:r>
@@ -620,6 +682,7 @@
       <w:r>
         <w:rPr>
           <w:b/>
+          <w:bCs/>
         </w:rPr>
         <w:t xml:space="preserve">Ctrl+N</w:t>
       </w:r>
@@ -638,6 +701,7 @@
       <w:r>
         <w:rPr>
           <w:b/>
+          <w:bCs/>
         </w:rPr>
         <w:t xml:space="preserve">Description:</w:t>
       </w:r>
@@ -665,6 +729,7 @@
       <w:r>
         <w:rPr>
           <w:b/>
+          <w:bCs/>
         </w:rPr>
         <w:t xml:space="preserve">Date:</w:t>
       </w:r>
@@ -686,6 +751,7 @@
       <w:r>
         <w:rPr>
           <w:b/>
+          <w:bCs/>
         </w:rPr>
         <w:t xml:space="preserve">All day</w:t>
       </w:r>
@@ -695,6 +761,7 @@
       <w:r>
         <w:rPr>
           <w:b/>
+          <w:bCs/>
         </w:rPr>
         <w:t xml:space="preserve">Time</w:t>
       </w:r>
@@ -704,6 +771,7 @@
       <w:r>
         <w:rPr>
           <w:b/>
+          <w:bCs/>
         </w:rPr>
         <w:t xml:space="preserve">Ends</w:t>
       </w:r>
@@ -725,6 +793,7 @@
       <w:r>
         <w:rPr>
           <w:b/>
+          <w:bCs/>
         </w:rPr>
         <w:t xml:space="preserve">Repeat</w:t>
       </w:r>
@@ -734,6 +803,7 @@
       <w:r>
         <w:rPr>
           <w:b/>
+          <w:bCs/>
         </w:rPr>
         <w:t xml:space="preserve">Does not repeat</w:t>
       </w:r>
@@ -752,6 +822,7 @@
       <w:r>
         <w:rPr>
           <w:b/>
+          <w:bCs/>
         </w:rPr>
         <w:t xml:space="preserve">Alarm:</w:t>
       </w:r>
@@ -761,6 +832,7 @@
       <w:r>
         <w:rPr>
           <w:b/>
+          <w:bCs/>
         </w:rPr>
         <w:t xml:space="preserve">1 hour before</w:t>
       </w:r>
@@ -782,6 +854,7 @@
       <w:r>
         <w:rPr>
           <w:b/>
+          <w:bCs/>
         </w:rPr>
         <w:t xml:space="preserve">Category</w:t>
       </w:r>
@@ -800,6 +873,7 @@
       <w:r>
         <w:rPr>
           <w:b/>
+          <w:bCs/>
         </w:rPr>
         <w:t xml:space="preserve">Location</w:t>
       </w:r>
@@ -818,6 +892,7 @@
       <w:r>
         <w:rPr>
           <w:b/>
+          <w:bCs/>
         </w:rPr>
         <w:t xml:space="preserve">Notes</w:t>
       </w:r>
@@ -848,6 +923,7 @@
       <w:r>
         <w:rPr>
           <w:b/>
+          <w:bCs/>
         </w:rPr>
         <w:t xml:space="preserve">Save</w:t>
       </w:r>
@@ -857,6 +933,7 @@
       <w:r>
         <w:rPr>
           <w:b/>
+          <w:bCs/>
         </w:rPr>
         <w:t xml:space="preserve">Ctrl+S</w:t>
       </w:r>
@@ -925,6 +1002,7 @@
       <w:r>
         <w:rPr>
           <w:i/>
+          <w:iCs/>
         </w:rPr>
         <w:t xml:space="preserve">Pay the hydro bill on the 5th of every month, reminded the day before at 9:00 AM.</w:t>
       </w:r>
@@ -943,6 +1021,7 @@
       <w:r>
         <w:rPr>
           <w:b/>
+          <w:bCs/>
         </w:rPr>
         <w:t xml:space="preserve">＋ Reminder</w:t>
       </w:r>
@@ -961,6 +1040,7 @@
       <w:r>
         <w:rPr>
           <w:b/>
+          <w:bCs/>
         </w:rPr>
         <w:t xml:space="preserve">Description:</w:t>
       </w:r>
@@ -988,6 +1068,7 @@
       <w:r>
         <w:rPr>
           <w:b/>
+          <w:bCs/>
         </w:rPr>
         <w:t xml:space="preserve">Date:</w:t>
       </w:r>
@@ -997,6 +1078,7 @@
       <w:r>
         <w:rPr>
           <w:b/>
+          <w:bCs/>
         </w:rPr>
         <w:t xml:space="preserve">All day</w:t>
       </w:r>
@@ -1015,6 +1097,7 @@
       <w:r>
         <w:rPr>
           <w:b/>
+          <w:bCs/>
         </w:rPr>
         <w:t xml:space="preserve">Repeat:</w:t>
       </w:r>
@@ -1024,6 +1107,7 @@
       <w:r>
         <w:rPr>
           <w:b/>
+          <w:bCs/>
         </w:rPr>
         <w:t xml:space="preserve">Monthly</w:t>
       </w:r>
@@ -1033,6 +1117,7 @@
       <w:r>
         <w:rPr>
           <w:b/>
+          <w:bCs/>
         </w:rPr>
         <w:t xml:space="preserve">1</w:t>
       </w:r>
@@ -1042,6 +1127,7 @@
       <w:r>
         <w:rPr>
           <w:b/>
+          <w:bCs/>
         </w:rPr>
         <w:t xml:space="preserve">On:</w:t>
       </w:r>
@@ -1051,6 +1137,7 @@
       <w:r>
         <w:rPr>
           <w:b/>
+          <w:bCs/>
         </w:rPr>
         <w:t xml:space="preserve">Ends:</w:t>
       </w:r>
@@ -1069,6 +1156,7 @@
       <w:r>
         <w:rPr>
           <w:b/>
+          <w:bCs/>
         </w:rPr>
         <w:t xml:space="preserve">Alarm:</w:t>
       </w:r>
@@ -1078,6 +1166,7 @@
       <w:r>
         <w:rPr>
           <w:b/>
+          <w:bCs/>
         </w:rPr>
         <w:t xml:space="preserve">Remind me…</w:t>
       </w:r>
@@ -1087,6 +1176,7 @@
       <w:r>
         <w:rPr>
           <w:b/>
+          <w:bCs/>
         </w:rPr>
         <w:t xml:space="preserve">1 day before</w:t>
       </w:r>
@@ -1096,6 +1186,7 @@
       <w:r>
         <w:rPr>
           <w:b/>
+          <w:bCs/>
         </w:rPr>
         <w:t xml:space="preserve">9:00 AM</w:t>
       </w:r>
@@ -1117,6 +1208,7 @@
       <w:r>
         <w:rPr>
           <w:b/>
+          <w:bCs/>
         </w:rPr>
         <w:t xml:space="preserve">Remind me daily until completed</w:t>
       </w:r>
@@ -1135,6 +1227,7 @@
       <w:r>
         <w:rPr>
           <w:b/>
+          <w:bCs/>
         </w:rPr>
         <w:t xml:space="preserve">Category:</w:t>
       </w:r>
@@ -1153,6 +1246,7 @@
       <w:r>
         <w:rPr>
           <w:b/>
+          <w:bCs/>
         </w:rPr>
         <w:t xml:space="preserve">Save</w:t>
       </w:r>
@@ -1204,6 +1298,7 @@
       <w:r>
         <w:rPr>
           <w:b/>
+          <w:bCs/>
         </w:rPr>
         <w:t xml:space="preserve">Show → All reminders</w:t>
       </w:r>
@@ -1213,6 +1308,7 @@
       <w:r>
         <w:rPr>
           <w:b/>
+          <w:bCs/>
         </w:rPr>
         <w:t xml:space="preserve">Past</w:t>
       </w:r>
@@ -1454,6 +1550,7 @@
       <w:r>
         <w:rPr>
           <w:b/>
+          <w:bCs/>
         </w:rPr>
         <w:t xml:space="preserve">Snooze:</w:t>
       </w:r>
@@ -1463,6 +1560,7 @@
       <w:r>
         <w:rPr>
           <w:b/>
+          <w:bCs/>
         </w:rPr>
         <w:t xml:space="preserve">until…</w:t>
       </w:r>
@@ -1490,6 +1588,7 @@
       <w:r>
         <w:rPr>
           <w:b/>
+          <w:bCs/>
         </w:rPr>
         <w:t xml:space="preserve">Done:</w:t>
       </w:r>
@@ -1508,6 +1607,7 @@
       <w:r>
         <w:rPr>
           <w:b/>
+          <w:bCs/>
         </w:rPr>
         <w:t xml:space="preserve">Open:</w:t>
       </w:r>
@@ -1526,6 +1626,7 @@
       <w:r>
         <w:rPr>
           <w:b/>
+          <w:bCs/>
         </w:rPr>
         <w:t xml:space="preserve">Dismiss:</w:t>
       </w:r>
@@ -1544,6 +1645,7 @@
       <w:r>
         <w:rPr>
           <w:b/>
+          <w:bCs/>
         </w:rPr>
         <w:t xml:space="preserve">Worth setting up next</w:t>
       </w:r>
@@ -1609,6 +1711,7 @@
             <w:r>
               <w:rPr>
                 <w:b/>
+                <w:bCs/>
               </w:rPr>
               <w:t xml:space="preserve">＋ List Item</w:t>
             </w:r>
@@ -1642,6 +1745,7 @@
             <w:r>
               <w:rPr>
                 <w:b/>
+                <w:bCs/>
               </w:rPr>
               <w:t xml:space="preserve">List dropdown</w:t>
             </w:r>
@@ -1651,6 +1755,7 @@
             <w:r>
               <w:rPr>
                 <w:b/>
+                <w:bCs/>
               </w:rPr>
               <w:t xml:space="preserve">＋ New list…</w:t>
             </w:r>
@@ -1678,6 +1783,7 @@
             <w:r>
               <w:rPr>
                 <w:b/>
+                <w:bCs/>
               </w:rPr>
               <w:t xml:space="preserve">⏰ Quick alarm</w:t>
             </w:r>
@@ -1708,6 +1814,7 @@
             <w:r>
               <w:rPr>
                 <w:b/>
+                <w:bCs/>
               </w:rPr>
               <w:t xml:space="preserve">Settings → General / Display</w:t>
             </w:r>
@@ -1735,6 +1842,7 @@
             <w:r>
               <w:rPr>
                 <w:b/>
+                <w:bCs/>
               </w:rPr>
               <w:t xml:space="preserve">Settings → Display → Language</w:t>
             </w:r>
@@ -1762,6 +1870,7 @@
             <w:r>
               <w:rPr>
                 <w:b/>
+                <w:bCs/>
               </w:rPr>
               <w:t xml:space="preserve">Settings → Display → Columns; Show completed in each toolbar</w:t>
             </w:r>
@@ -1789,6 +1898,7 @@
             <w:r>
               <w:rPr>
                 <w:b/>
+                <w:bCs/>
               </w:rPr>
               <w:t xml:space="preserve">Settings → Alarms</w:t>
             </w:r>
@@ -1816,6 +1926,7 @@
             <w:r>
               <w:rPr>
                 <w:b/>
+                <w:bCs/>
               </w:rPr>
               <w:t xml:space="preserve">Settings → Data → Back up now</w:t>
             </w:r>
@@ -2088,7 +2199,9 @@
     </w:pPr>
     <w:rPr>
       <w:b/>
+      <w:bCs/>
       <w:sz w:val="32"/>
+      <w:szCs w:val="32"/>
     </w:rPr>
   </w:style>
   <w:style w:type="paragraph" w:styleId="Heading2">
@@ -2103,7 +2216,9 @@
     </w:pPr>
     <w:rPr>
       <w:b/>
+      <w:bCs/>
       <w:sz w:val="26"/>
+      <w:szCs w:val="26"/>
     </w:rPr>
   </w:style>
   <w:style w:type="paragraph" w:styleId="Heading3">
@@ -2118,7 +2233,9 @@
     </w:pPr>
     <w:rPr>
       <w:b/>
+      <w:bCs/>
       <w:sz w:val="24"/>
+      <w:szCs w:val="24"/>
     </w:rPr>
   </w:style>
   <w:style w:type="paragraph" w:styleId="Heading4">
@@ -2132,7 +2249,9 @@
     </w:pPr>
     <w:rPr>
       <w:b/>
+      <w:bCs/>
       <w:sz w:val="22"/>
+      <w:szCs w:val="22"/>
     </w:rPr>
   </w:style>
   <w:style w:type="paragraph" w:styleId="Heading5">
@@ -2146,7 +2265,9 @@
     </w:pPr>
     <w:rPr>
       <w:b/>
+      <w:bCs/>
       <w:sz w:val="22"/>
+      <w:szCs w:val="22"/>
     </w:rPr>
   </w:style>
   <w:style w:type="paragraph" w:styleId="Heading6">
@@ -2160,7 +2281,9 @@
     </w:pPr>
     <w:rPr>
       <w:i/>
+      <w:iCs/>
       <w:sz w:val="22"/>
+      <w:szCs w:val="22"/>
     </w:rPr>
   </w:style>
   <w:style w:type="paragraph" w:styleId="Title">
@@ -2174,6 +2297,7 @@
     </w:pPr>
     <w:rPr>
       <w:sz w:val="56"/>
+      <w:szCs w:val="56"/>
     </w:rPr>
   </w:style>
   <w:style w:type="paragraph" w:styleId="Quote">
@@ -2188,6 +2312,7 @@
     </w:pPr>
     <w:rPr>
       <w:i/>
+      <w:iCs/>
       <w:color w:val="404040"/>
     </w:rPr>
   </w:style>
@@ -2203,6 +2328,7 @@
     <w:rPr>
       <w:rFonts w:ascii="Consolas" w:hAnsi="Consolas" w:eastAsia="Consolas" w:cs="Consolas"/>
       <w:sz w:val="20"/>
+      <w:szCs w:val="20"/>
     </w:rPr>
   </w:style>
   <w:style w:type="character" w:styleId="CodeChar">
@@ -2211,6 +2337,7 @@
     <w:rPr>
       <w:rFonts w:ascii="Consolas" w:hAnsi="Consolas" w:eastAsia="Consolas" w:cs="Consolas"/>
       <w:sz w:val="20"/>
+      <w:szCs w:val="20"/>
       <w:shd w:val="clear" w:color="auto" w:fill="F5F5F5"/>
     </w:rPr>
   </w:style>

</xml_diff>

<commit_message>
Roll back to 0.9.1 (revert "ReminderFoxAgain 0.9.2: a standard Windows installer (NSIS)")
This reverts commit a60d11e: Windows goes back to the .bat + PowerShell setup of 0.9.1. The NSIS installer
remains in the history at a60d11e if it's wanted later.

Co-Authored-By: Claude Opus 5.5 <noreply@anthropic.com>
Claude-Session: https://claude.ai/code/session_01KZ8RpfjgQtZthigNSkA5xL
</commit_message>
<xml_diff>
--- a/docs/word/quick-start.docx
+++ b/docs/word/quick-start.docx
@@ -7,7 +7,7 @@
         <w:pStyle w:val="Heading1"/>
       </w:pPr>
       <w:r>
-        <w:t xml:space="preserve">ReminderFoxAgain 0.9.2 — Quick Start</w:t>
+        <w:t xml:space="preserve">ReminderFoxAgain 0.9.1 — Quick Start</w:t>
       </w:r>
     </w:p>
     <w:p>
@@ -45,17 +45,7 @@
         </w:numPr>
       </w:pPr>
       <w:r>
-        <w:t xml:space="preserve">Download </w:t>
-      </w:r>
-      <w:r>
-        <w:rPr>
-          <w:b/>
-          <w:bCs/>
-        </w:rPr>
-        <w:t xml:space="preserve">ReminderFoxAgain-Setup-0.9.2.exe</w:t>
-      </w:r>
-      <w:r>
-        <w:t xml:space="preserve"> and run it. No administrator rights are needed.</w:t>
+        <w:t xml:space="preserve">Put all the release files in one folder: the .bat, the .ps1, the .asar and the six runtime parts.</w:t>
       </w:r>
     </w:p>
     <w:p>
@@ -67,27 +57,16 @@
         </w:numPr>
       </w:pPr>
       <w:r>
-        <w:t xml:space="preserve">If Windows says "Windows protected your PC", choose </w:t>
-      </w:r>
-      <w:r>
-        <w:rPr>
-          <w:b/>
-          <w:bCs/>
-        </w:rPr>
-        <w:t xml:space="preserve">More info</w:t>
-      </w:r>
-      <w:r>
-        <w:t xml:space="preserve"> → </w:t>
-      </w:r>
-      <w:r>
-        <w:rPr>
-          <w:b/>
-          <w:bCs/>
-        </w:rPr>
-        <w:t xml:space="preserve">Run anyway</w:t>
-      </w:r>
-      <w:r>
-        <w:t xml:space="preserve">. The installer isn't code-signed yet.</w:t>
+        <w:t xml:space="preserve">Double-click </w:t>
+      </w:r>
+      <w:r>
+        <w:rPr>
+          <w:b/>
+        </w:rPr>
+        <w:t xml:space="preserve">Install or Update ReminderFoxAgain.bat</w:t>
+      </w:r>
+      <w:r>
+        <w:t xml:space="preserve">. No administrator rights are needed.</w:t>
       </w:r>
     </w:p>
     <w:p>
@@ -99,27 +78,7 @@
         </w:numPr>
       </w:pPr>
       <w:r>
-        <w:t xml:space="preserve">Click </w:t>
-      </w:r>
-      <w:r>
-        <w:rPr>
-          <w:b/>
-          <w:bCs/>
-        </w:rPr>
-        <w:t xml:space="preserve">Install</w:t>
-      </w:r>
-      <w:r>
-        <w:t xml:space="preserve">, then </w:t>
-      </w:r>
-      <w:r>
-        <w:rPr>
-          <w:b/>
-          <w:bCs/>
-        </w:rPr>
-        <w:t xml:space="preserve">Finish</w:t>
-      </w:r>
-      <w:r>
-        <w:t xml:space="preserve">. ReminderFoxAgain starts, and it also has a Start-menu and a desktop shortcut.</w:t>
+        <w:t xml:space="preserve">When it says it's done, ReminderFoxAgain starts. It also has a Start-menu and a desktop shortcut.</w:t>
       </w:r>
     </w:p>
     <w:p>
@@ -130,7 +89,6 @@
       <w:r>
         <w:rPr>
           <w:b/>
-          <w:bCs/>
         </w:rPr>
         <w:t xml:space="preserve">On a Mac</w:t>
       </w:r>
@@ -141,7 +99,7 @@
         <w:rPr>
           <w:rStyle w:val="CodeChar"/>
         </w:rPr>
-        <w:t xml:space="preserve">ReminderFoxAgain-0.9.2-macos-universal.zip</w:t>
+        <w:t xml:space="preserve">ReminderFoxAgain-0.9.1-macos-universal.zip</w:t>
       </w:r>
       <w:r>
         <w:t xml:space="preserve">, drag the app into Applications, and open it once with System Settings → Privacy &amp; Security → </w:t>
@@ -149,7 +107,6 @@
       <w:r>
         <w:rPr>
           <w:b/>
-          <w:bCs/>
         </w:rPr>
         <w:t xml:space="preserve">Open Anyway</w:t>
       </w:r>
@@ -159,7 +116,6 @@
       <w:r>
         <w:rPr>
           <w:b/>
-          <w:bCs/>
         </w:rPr>
         <w:t xml:space="preserve">Open</w:t>
       </w:r>
@@ -169,7 +125,6 @@
       <w:r>
         <w:rPr>
           <w:b/>
-          <w:bCs/>
         </w:rPr>
         <w:t xml:space="preserve">On Linux</w:t>
       </w:r>
@@ -180,7 +135,7 @@
         <w:rPr>
           <w:rStyle w:val="CodeChar"/>
         </w:rPr>
-        <w:t xml:space="preserve">sudo apt install ./reminderfoxagain_0.9.2_amd64.deb</w:t>
+        <w:t xml:space="preserve">sudo apt install ./reminderfoxagain_0.9.1_amd64.deb</w:t>
       </w:r>
       <w:r>
         <w:t xml:space="preserve">, or unpack the </w:t>
@@ -207,7 +162,7 @@
     <w:p>
       <w:pPr/>
       <w:r>
-        <w:t xml:space="preserve">Already have ReminderFoxAgain? Run the new Setup file; it updates the installed copy, including one made by the earlier .bat setup. Your data is never touched by an update.</w:t>
+        <w:t xml:space="preserve">Already on 0.7.x? You only need the .bat, the .ps1 and the .asar. Coming from 0.6.x? Include the runtime parts too, so the date pickers speak your language. Your data is never touched by an update.</w:t>
       </w:r>
     </w:p>
     <w:p>
@@ -265,7 +220,6 @@
       <w:r>
         <w:rPr>
           <w:b/>
-          <w:bCs/>
         </w:rPr>
         <w:t xml:space="preserve">A. The app found your ReminderFox file</w:t>
       </w:r>
@@ -284,7 +238,6 @@
       <w:r>
         <w:rPr>
           <w:b/>
-          <w:bCs/>
         </w:rPr>
         <w:t xml:space="preserve">Import from your ReminderFox add-on</w:t>
       </w:r>
@@ -306,7 +259,6 @@
       <w:r>
         <w:rPr>
           <w:b/>
-          <w:bCs/>
         </w:rPr>
         <w:t xml:space="preserve">Import</w:t>
       </w:r>
@@ -316,7 +268,6 @@
       <w:r>
         <w:rPr>
           <w:b/>
-          <w:bCs/>
         </w:rPr>
         <w:t xml:space="preserve">Add to what I have</w:t>
       </w:r>
@@ -326,7 +277,6 @@
       <w:r>
         <w:rPr>
           <w:b/>
-          <w:bCs/>
         </w:rPr>
         <w:t xml:space="preserve">Skip</w:t>
       </w:r>
@@ -336,7 +286,6 @@
       <w:r>
         <w:rPr>
           <w:b/>
-          <w:bCs/>
         </w:rPr>
         <w:t xml:space="preserve">Import</w:t>
       </w:r>
@@ -406,7 +355,6 @@
       <w:r>
         <w:rPr>
           <w:b/>
-          <w:bCs/>
         </w:rPr>
         <w:t xml:space="preserve">B. You have the file somewhere else</w:t>
       </w:r>
@@ -437,7 +385,6 @@
       <w:r>
         <w:rPr>
           <w:b/>
-          <w:bCs/>
         </w:rPr>
         <w:t xml:space="preserve">Import a reminderfox.ics or other calendar file…</w:t>
       </w:r>
@@ -465,7 +412,6 @@
       <w:r>
         <w:rPr>
           <w:b/>
-          <w:bCs/>
         </w:rPr>
         <w:t xml:space="preserve">Import</w:t>
       </w:r>
@@ -475,7 +421,6 @@
       <w:r>
         <w:rPr>
           <w:b/>
-          <w:bCs/>
         </w:rPr>
         <w:t xml:space="preserve">Category</w:t>
       </w:r>
@@ -497,7 +442,6 @@
       <w:r>
         <w:rPr>
           <w:b/>
-          <w:bCs/>
         </w:rPr>
         <w:t xml:space="preserve">C. Where the add-on kept its file</w:t>
       </w:r>
@@ -564,7 +508,6 @@
       <w:r>
         <w:rPr>
           <w:b/>
-          <w:bCs/>
         </w:rPr>
         <w:t xml:space="preserve">(Ctrl+I) from Settings → Data → Import an .ics file… or</w:t>
       </w:r>
@@ -574,7 +517,6 @@
       <w:r>
         <w:rPr>
           <w:b/>
-          <w:bCs/>
         </w:rPr>
         <w:t xml:space="preserve">Import from ReminderFox…</w:t>
       </w:r>
@@ -604,7 +546,6 @@
       <w:r>
         <w:rPr>
           <w:b/>
-          <w:bCs/>
         </w:rPr>
         <w:t xml:space="preserve">Start with an empty list</w:t>
       </w:r>
@@ -632,7 +573,6 @@
       <w:r>
         <w:rPr>
           <w:b/>
-          <w:bCs/>
         </w:rPr>
         <w:t xml:space="preserve">from Settings → Data → Import an .ics file… (Ctrl+I)</w:t>
       </w:r>
@@ -653,7 +593,6 @@
       <w:r>
         <w:rPr>
           <w:i/>
-          <w:iCs/>
         </w:rPr>
         <w:t xml:space="preserve">Dentist appointment on Monday, Oct 26 at 2:30 PM, with an alarm an hour before.</w:t>
       </w:r>
@@ -672,7 +611,6 @@
       <w:r>
         <w:rPr>
           <w:b/>
-          <w:bCs/>
         </w:rPr>
         <w:t xml:space="preserve">＋ Reminder</w:t>
       </w:r>
@@ -682,7 +620,6 @@
       <w:r>
         <w:rPr>
           <w:b/>
-          <w:bCs/>
         </w:rPr>
         <w:t xml:space="preserve">Ctrl+N</w:t>
       </w:r>
@@ -701,7 +638,6 @@
       <w:r>
         <w:rPr>
           <w:b/>
-          <w:bCs/>
         </w:rPr>
         <w:t xml:space="preserve">Description:</w:t>
       </w:r>
@@ -729,7 +665,6 @@
       <w:r>
         <w:rPr>
           <w:b/>
-          <w:bCs/>
         </w:rPr>
         <w:t xml:space="preserve">Date:</w:t>
       </w:r>
@@ -751,7 +686,6 @@
       <w:r>
         <w:rPr>
           <w:b/>
-          <w:bCs/>
         </w:rPr>
         <w:t xml:space="preserve">All day</w:t>
       </w:r>
@@ -761,7 +695,6 @@
       <w:r>
         <w:rPr>
           <w:b/>
-          <w:bCs/>
         </w:rPr>
         <w:t xml:space="preserve">Time</w:t>
       </w:r>
@@ -771,7 +704,6 @@
       <w:r>
         <w:rPr>
           <w:b/>
-          <w:bCs/>
         </w:rPr>
         <w:t xml:space="preserve">Ends</w:t>
       </w:r>
@@ -793,7 +725,6 @@
       <w:r>
         <w:rPr>
           <w:b/>
-          <w:bCs/>
         </w:rPr>
         <w:t xml:space="preserve">Repeat</w:t>
       </w:r>
@@ -803,7 +734,6 @@
       <w:r>
         <w:rPr>
           <w:b/>
-          <w:bCs/>
         </w:rPr>
         <w:t xml:space="preserve">Does not repeat</w:t>
       </w:r>
@@ -822,7 +752,6 @@
       <w:r>
         <w:rPr>
           <w:b/>
-          <w:bCs/>
         </w:rPr>
         <w:t xml:space="preserve">Alarm:</w:t>
       </w:r>
@@ -832,7 +761,6 @@
       <w:r>
         <w:rPr>
           <w:b/>
-          <w:bCs/>
         </w:rPr>
         <w:t xml:space="preserve">1 hour before</w:t>
       </w:r>
@@ -854,7 +782,6 @@
       <w:r>
         <w:rPr>
           <w:b/>
-          <w:bCs/>
         </w:rPr>
         <w:t xml:space="preserve">Category</w:t>
       </w:r>
@@ -873,7 +800,6 @@
       <w:r>
         <w:rPr>
           <w:b/>
-          <w:bCs/>
         </w:rPr>
         <w:t xml:space="preserve">Location</w:t>
       </w:r>
@@ -892,7 +818,6 @@
       <w:r>
         <w:rPr>
           <w:b/>
-          <w:bCs/>
         </w:rPr>
         <w:t xml:space="preserve">Notes</w:t>
       </w:r>
@@ -923,7 +848,6 @@
       <w:r>
         <w:rPr>
           <w:b/>
-          <w:bCs/>
         </w:rPr>
         <w:t xml:space="preserve">Save</w:t>
       </w:r>
@@ -933,7 +857,6 @@
       <w:r>
         <w:rPr>
           <w:b/>
-          <w:bCs/>
         </w:rPr>
         <w:t xml:space="preserve">Ctrl+S</w:t>
       </w:r>
@@ -1002,7 +925,6 @@
       <w:r>
         <w:rPr>
           <w:i/>
-          <w:iCs/>
         </w:rPr>
         <w:t xml:space="preserve">Pay the hydro bill on the 5th of every month, reminded the day before at 9:00 AM.</w:t>
       </w:r>
@@ -1021,7 +943,6 @@
       <w:r>
         <w:rPr>
           <w:b/>
-          <w:bCs/>
         </w:rPr>
         <w:t xml:space="preserve">＋ Reminder</w:t>
       </w:r>
@@ -1040,7 +961,6 @@
       <w:r>
         <w:rPr>
           <w:b/>
-          <w:bCs/>
         </w:rPr>
         <w:t xml:space="preserve">Description:</w:t>
       </w:r>
@@ -1068,7 +988,6 @@
       <w:r>
         <w:rPr>
           <w:b/>
-          <w:bCs/>
         </w:rPr>
         <w:t xml:space="preserve">Date:</w:t>
       </w:r>
@@ -1078,7 +997,6 @@
       <w:r>
         <w:rPr>
           <w:b/>
-          <w:bCs/>
         </w:rPr>
         <w:t xml:space="preserve">All day</w:t>
       </w:r>
@@ -1097,7 +1015,6 @@
       <w:r>
         <w:rPr>
           <w:b/>
-          <w:bCs/>
         </w:rPr>
         <w:t xml:space="preserve">Repeat:</w:t>
       </w:r>
@@ -1107,7 +1024,6 @@
       <w:r>
         <w:rPr>
           <w:b/>
-          <w:bCs/>
         </w:rPr>
         <w:t xml:space="preserve">Monthly</w:t>
       </w:r>
@@ -1117,7 +1033,6 @@
       <w:r>
         <w:rPr>
           <w:b/>
-          <w:bCs/>
         </w:rPr>
         <w:t xml:space="preserve">1</w:t>
       </w:r>
@@ -1127,7 +1042,6 @@
       <w:r>
         <w:rPr>
           <w:b/>
-          <w:bCs/>
         </w:rPr>
         <w:t xml:space="preserve">On:</w:t>
       </w:r>
@@ -1137,7 +1051,6 @@
       <w:r>
         <w:rPr>
           <w:b/>
-          <w:bCs/>
         </w:rPr>
         <w:t xml:space="preserve">Ends:</w:t>
       </w:r>
@@ -1156,7 +1069,6 @@
       <w:r>
         <w:rPr>
           <w:b/>
-          <w:bCs/>
         </w:rPr>
         <w:t xml:space="preserve">Alarm:</w:t>
       </w:r>
@@ -1166,7 +1078,6 @@
       <w:r>
         <w:rPr>
           <w:b/>
-          <w:bCs/>
         </w:rPr>
         <w:t xml:space="preserve">Remind me…</w:t>
       </w:r>
@@ -1176,7 +1087,6 @@
       <w:r>
         <w:rPr>
           <w:b/>
-          <w:bCs/>
         </w:rPr>
         <w:t xml:space="preserve">1 day before</w:t>
       </w:r>
@@ -1186,7 +1096,6 @@
       <w:r>
         <w:rPr>
           <w:b/>
-          <w:bCs/>
         </w:rPr>
         <w:t xml:space="preserve">9:00 AM</w:t>
       </w:r>
@@ -1208,7 +1117,6 @@
       <w:r>
         <w:rPr>
           <w:b/>
-          <w:bCs/>
         </w:rPr>
         <w:t xml:space="preserve">Remind me daily until completed</w:t>
       </w:r>
@@ -1227,7 +1135,6 @@
       <w:r>
         <w:rPr>
           <w:b/>
-          <w:bCs/>
         </w:rPr>
         <w:t xml:space="preserve">Category:</w:t>
       </w:r>
@@ -1246,7 +1153,6 @@
       <w:r>
         <w:rPr>
           <w:b/>
-          <w:bCs/>
         </w:rPr>
         <w:t xml:space="preserve">Save</w:t>
       </w:r>
@@ -1298,7 +1204,6 @@
       <w:r>
         <w:rPr>
           <w:b/>
-          <w:bCs/>
         </w:rPr>
         <w:t xml:space="preserve">Show → All reminders</w:t>
       </w:r>
@@ -1308,7 +1213,6 @@
       <w:r>
         <w:rPr>
           <w:b/>
-          <w:bCs/>
         </w:rPr>
         <w:t xml:space="preserve">Past</w:t>
       </w:r>
@@ -1550,7 +1454,6 @@
       <w:r>
         <w:rPr>
           <w:b/>
-          <w:bCs/>
         </w:rPr>
         <w:t xml:space="preserve">Snooze:</w:t>
       </w:r>
@@ -1560,7 +1463,6 @@
       <w:r>
         <w:rPr>
           <w:b/>
-          <w:bCs/>
         </w:rPr>
         <w:t xml:space="preserve">until…</w:t>
       </w:r>
@@ -1588,7 +1490,6 @@
       <w:r>
         <w:rPr>
           <w:b/>
-          <w:bCs/>
         </w:rPr>
         <w:t xml:space="preserve">Done:</w:t>
       </w:r>
@@ -1607,7 +1508,6 @@
       <w:r>
         <w:rPr>
           <w:b/>
-          <w:bCs/>
         </w:rPr>
         <w:t xml:space="preserve">Open:</w:t>
       </w:r>
@@ -1626,7 +1526,6 @@
       <w:r>
         <w:rPr>
           <w:b/>
-          <w:bCs/>
         </w:rPr>
         <w:t xml:space="preserve">Dismiss:</w:t>
       </w:r>
@@ -1645,7 +1544,6 @@
       <w:r>
         <w:rPr>
           <w:b/>
-          <w:bCs/>
         </w:rPr>
         <w:t xml:space="preserve">Worth setting up next</w:t>
       </w:r>
@@ -1711,7 +1609,6 @@
             <w:r>
               <w:rPr>
                 <w:b/>
-                <w:bCs/>
               </w:rPr>
               <w:t xml:space="preserve">＋ List Item</w:t>
             </w:r>
@@ -1745,7 +1642,6 @@
             <w:r>
               <w:rPr>
                 <w:b/>
-                <w:bCs/>
               </w:rPr>
               <w:t xml:space="preserve">List dropdown</w:t>
             </w:r>
@@ -1755,7 +1651,6 @@
             <w:r>
               <w:rPr>
                 <w:b/>
-                <w:bCs/>
               </w:rPr>
               <w:t xml:space="preserve">＋ New list…</w:t>
             </w:r>
@@ -1783,7 +1678,6 @@
             <w:r>
               <w:rPr>
                 <w:b/>
-                <w:bCs/>
               </w:rPr>
               <w:t xml:space="preserve">⏰ Quick alarm</w:t>
             </w:r>
@@ -1814,7 +1708,6 @@
             <w:r>
               <w:rPr>
                 <w:b/>
-                <w:bCs/>
               </w:rPr>
               <w:t xml:space="preserve">Settings → General / Display</w:t>
             </w:r>
@@ -1842,7 +1735,6 @@
             <w:r>
               <w:rPr>
                 <w:b/>
-                <w:bCs/>
               </w:rPr>
               <w:t xml:space="preserve">Settings → Display → Language</w:t>
             </w:r>
@@ -1870,7 +1762,6 @@
             <w:r>
               <w:rPr>
                 <w:b/>
-                <w:bCs/>
               </w:rPr>
               <w:t xml:space="preserve">Settings → Display → Columns; Show completed in each toolbar</w:t>
             </w:r>
@@ -1898,7 +1789,6 @@
             <w:r>
               <w:rPr>
                 <w:b/>
-                <w:bCs/>
               </w:rPr>
               <w:t xml:space="preserve">Settings → Alarms</w:t>
             </w:r>
@@ -1926,7 +1816,6 @@
             <w:r>
               <w:rPr>
                 <w:b/>
-                <w:bCs/>
               </w:rPr>
               <w:t xml:space="preserve">Settings → Data → Back up now</w:t>
             </w:r>
@@ -2199,9 +2088,7 @@
     </w:pPr>
     <w:rPr>
       <w:b/>
-      <w:bCs/>
       <w:sz w:val="32"/>
-      <w:szCs w:val="32"/>
     </w:rPr>
   </w:style>
   <w:style w:type="paragraph" w:styleId="Heading2">
@@ -2216,9 +2103,7 @@
     </w:pPr>
     <w:rPr>
       <w:b/>
-      <w:bCs/>
       <w:sz w:val="26"/>
-      <w:szCs w:val="26"/>
     </w:rPr>
   </w:style>
   <w:style w:type="paragraph" w:styleId="Heading3">
@@ -2233,9 +2118,7 @@
     </w:pPr>
     <w:rPr>
       <w:b/>
-      <w:bCs/>
       <w:sz w:val="24"/>
-      <w:szCs w:val="24"/>
     </w:rPr>
   </w:style>
   <w:style w:type="paragraph" w:styleId="Heading4">
@@ -2249,9 +2132,7 @@
     </w:pPr>
     <w:rPr>
       <w:b/>
-      <w:bCs/>
       <w:sz w:val="22"/>
-      <w:szCs w:val="22"/>
     </w:rPr>
   </w:style>
   <w:style w:type="paragraph" w:styleId="Heading5">
@@ -2265,9 +2146,7 @@
     </w:pPr>
     <w:rPr>
       <w:b/>
-      <w:bCs/>
       <w:sz w:val="22"/>
-      <w:szCs w:val="22"/>
     </w:rPr>
   </w:style>
   <w:style w:type="paragraph" w:styleId="Heading6">
@@ -2281,9 +2160,7 @@
     </w:pPr>
     <w:rPr>
       <w:i/>
-      <w:iCs/>
       <w:sz w:val="22"/>
-      <w:szCs w:val="22"/>
     </w:rPr>
   </w:style>
   <w:style w:type="paragraph" w:styleId="Title">
@@ -2297,7 +2174,6 @@
     </w:pPr>
     <w:rPr>
       <w:sz w:val="56"/>
-      <w:szCs w:val="56"/>
     </w:rPr>
   </w:style>
   <w:style w:type="paragraph" w:styleId="Quote">
@@ -2312,7 +2188,6 @@
     </w:pPr>
     <w:rPr>
       <w:i/>
-      <w:iCs/>
       <w:color w:val="404040"/>
     </w:rPr>
   </w:style>
@@ -2328,7 +2203,6 @@
     <w:rPr>
       <w:rFonts w:ascii="Consolas" w:hAnsi="Consolas" w:eastAsia="Consolas" w:cs="Consolas"/>
       <w:sz w:val="20"/>
-      <w:szCs w:val="20"/>
     </w:rPr>
   </w:style>
   <w:style w:type="character" w:styleId="CodeChar">
@@ -2337,7 +2211,6 @@
     <w:rPr>
       <w:rFonts w:ascii="Consolas" w:hAnsi="Consolas" w:eastAsia="Consolas" w:cs="Consolas"/>
       <w:sz w:val="20"/>
-      <w:szCs w:val="20"/>
       <w:shd w:val="clear" w:color="auto" w:fill="F5F5F5"/>
     </w:rPr>
   </w:style>

</xml_diff>

<commit_message>
ReminderFoxAgain 0.9.2: fits the smallest window
- Version 0.9.2 in package.json, package-lock.json, the README, the docs,
  the build prompt pack (Android/iOS build 902) and feature-gaps.xlsx.
- CHANGELOG and README "What's new": the 820 px layout fix.
- User's Guide: what a narrow window looks like. Technical System
  Design: a "Narrow windows (0.9.2)" section. Developer's Guide and the
  build prompt: the layout checks at 820 px and the new e2e counts
  (658 checks in 37 runs).
- docs/*.md and docs/word/*.docx exported again from the Claude Docs.
- README pictures: the status bar shows 0.9.2 (nothing else changed;
  the app looks the same at 1180 px).

Co-Authored-By: Claude Opus 5.5 <noreply@anthropic.com>
Claude-Session: https://claude.ai/code/session_01JJP6L9dU2itRAGFeJexq3u
</commit_message>
<xml_diff>
--- a/docs/word/quick-start.docx
+++ b/docs/word/quick-start.docx
@@ -7,7 +7,7 @@
         <w:pStyle w:val="Heading1"/>
       </w:pPr>
       <w:r>
-        <w:t xml:space="preserve">ReminderFoxAgain 0.9.1 — Quick Start</w:t>
+        <w:t xml:space="preserve">ReminderFoxAgain 0.9.2 — Quick Start</w:t>
       </w:r>
     </w:p>
     <w:p>
@@ -62,6 +62,7 @@
       <w:r>
         <w:rPr>
           <w:b/>
+          <w:bCs/>
         </w:rPr>
         <w:t xml:space="preserve">Install or Update ReminderFoxAgain.bat</w:t>
       </w:r>
@@ -89,6 +90,7 @@
       <w:r>
         <w:rPr>
           <w:b/>
+          <w:bCs/>
         </w:rPr>
         <w:t xml:space="preserve">On a Mac</w:t>
       </w:r>
@@ -99,7 +101,7 @@
         <w:rPr>
           <w:rStyle w:val="CodeChar"/>
         </w:rPr>
-        <w:t xml:space="preserve">ReminderFoxAgain-0.9.1-macos-universal.zip</w:t>
+        <w:t xml:space="preserve">ReminderFoxAgain-0.9.2-macos-universal.zip</w:t>
       </w:r>
       <w:r>
         <w:t xml:space="preserve">, drag the app into Applications, and open it once with System Settings → Privacy &amp; Security → </w:t>
@@ -107,6 +109,7 @@
       <w:r>
         <w:rPr>
           <w:b/>
+          <w:bCs/>
         </w:rPr>
         <w:t xml:space="preserve">Open Anyway</w:t>
       </w:r>
@@ -116,6 +119,7 @@
       <w:r>
         <w:rPr>
           <w:b/>
+          <w:bCs/>
         </w:rPr>
         <w:t xml:space="preserve">Open</w:t>
       </w:r>
@@ -125,6 +129,7 @@
       <w:r>
         <w:rPr>
           <w:b/>
+          <w:bCs/>
         </w:rPr>
         <w:t xml:space="preserve">On Linux</w:t>
       </w:r>
@@ -135,7 +140,7 @@
         <w:rPr>
           <w:rStyle w:val="CodeChar"/>
         </w:rPr>
-        <w:t xml:space="preserve">sudo apt install ./reminderfoxagain_0.9.1_amd64.deb</w:t>
+        <w:t xml:space="preserve">sudo apt install ./reminderfoxagain_0.9.2_amd64.deb</w:t>
       </w:r>
       <w:r>
         <w:t xml:space="preserve">, or unpack the </w:t>
@@ -220,6 +225,7 @@
       <w:r>
         <w:rPr>
           <w:b/>
+          <w:bCs/>
         </w:rPr>
         <w:t xml:space="preserve">A. The app found your ReminderFox file</w:t>
       </w:r>
@@ -238,6 +244,7 @@
       <w:r>
         <w:rPr>
           <w:b/>
+          <w:bCs/>
         </w:rPr>
         <w:t xml:space="preserve">Import from your ReminderFox add-on</w:t>
       </w:r>
@@ -259,6 +266,7 @@
       <w:r>
         <w:rPr>
           <w:b/>
+          <w:bCs/>
         </w:rPr>
         <w:t xml:space="preserve">Import</w:t>
       </w:r>
@@ -268,6 +276,7 @@
       <w:r>
         <w:rPr>
           <w:b/>
+          <w:bCs/>
         </w:rPr>
         <w:t xml:space="preserve">Add to what I have</w:t>
       </w:r>
@@ -277,6 +286,7 @@
       <w:r>
         <w:rPr>
           <w:b/>
+          <w:bCs/>
         </w:rPr>
         <w:t xml:space="preserve">Skip</w:t>
       </w:r>
@@ -286,6 +296,7 @@
       <w:r>
         <w:rPr>
           <w:b/>
+          <w:bCs/>
         </w:rPr>
         <w:t xml:space="preserve">Import</w:t>
       </w:r>
@@ -355,6 +366,7 @@
       <w:r>
         <w:rPr>
           <w:b/>
+          <w:bCs/>
         </w:rPr>
         <w:t xml:space="preserve">B. You have the file somewhere else</w:t>
       </w:r>
@@ -385,6 +397,7 @@
       <w:r>
         <w:rPr>
           <w:b/>
+          <w:bCs/>
         </w:rPr>
         <w:t xml:space="preserve">Import a reminderfox.ics or other calendar file…</w:t>
       </w:r>
@@ -412,6 +425,7 @@
       <w:r>
         <w:rPr>
           <w:b/>
+          <w:bCs/>
         </w:rPr>
         <w:t xml:space="preserve">Import</w:t>
       </w:r>
@@ -421,6 +435,7 @@
       <w:r>
         <w:rPr>
           <w:b/>
+          <w:bCs/>
         </w:rPr>
         <w:t xml:space="preserve">Category</w:t>
       </w:r>
@@ -442,6 +457,7 @@
       <w:r>
         <w:rPr>
           <w:b/>
+          <w:bCs/>
         </w:rPr>
         <w:t xml:space="preserve">C. Where the add-on kept its file</w:t>
       </w:r>
@@ -508,6 +524,7 @@
       <w:r>
         <w:rPr>
           <w:b/>
+          <w:bCs/>
         </w:rPr>
         <w:t xml:space="preserve">(Ctrl+I) from Settings → Data → Import an .ics file… or</w:t>
       </w:r>
@@ -517,6 +534,7 @@
       <w:r>
         <w:rPr>
           <w:b/>
+          <w:bCs/>
         </w:rPr>
         <w:t xml:space="preserve">Import from ReminderFox…</w:t>
       </w:r>
@@ -546,6 +564,7 @@
       <w:r>
         <w:rPr>
           <w:b/>
+          <w:bCs/>
         </w:rPr>
         <w:t xml:space="preserve">Start with an empty list</w:t>
       </w:r>
@@ -573,6 +592,7 @@
       <w:r>
         <w:rPr>
           <w:b/>
+          <w:bCs/>
         </w:rPr>
         <w:t xml:space="preserve">from Settings → Data → Import an .ics file… (Ctrl+I)</w:t>
       </w:r>
@@ -593,6 +613,7 @@
       <w:r>
         <w:rPr>
           <w:i/>
+          <w:iCs/>
         </w:rPr>
         <w:t xml:space="preserve">Dentist appointment on Monday, Oct 26 at 2:30 PM, with an alarm an hour before.</w:t>
       </w:r>
@@ -611,6 +632,7 @@
       <w:r>
         <w:rPr>
           <w:b/>
+          <w:bCs/>
         </w:rPr>
         <w:t xml:space="preserve">＋ Reminder</w:t>
       </w:r>
@@ -620,6 +642,7 @@
       <w:r>
         <w:rPr>
           <w:b/>
+          <w:bCs/>
         </w:rPr>
         <w:t xml:space="preserve">Ctrl+N</w:t>
       </w:r>
@@ -638,6 +661,7 @@
       <w:r>
         <w:rPr>
           <w:b/>
+          <w:bCs/>
         </w:rPr>
         <w:t xml:space="preserve">Description:</w:t>
       </w:r>
@@ -665,6 +689,7 @@
       <w:r>
         <w:rPr>
           <w:b/>
+          <w:bCs/>
         </w:rPr>
         <w:t xml:space="preserve">Date:</w:t>
       </w:r>
@@ -686,6 +711,7 @@
       <w:r>
         <w:rPr>
           <w:b/>
+          <w:bCs/>
         </w:rPr>
         <w:t xml:space="preserve">All day</w:t>
       </w:r>
@@ -695,6 +721,7 @@
       <w:r>
         <w:rPr>
           <w:b/>
+          <w:bCs/>
         </w:rPr>
         <w:t xml:space="preserve">Time</w:t>
       </w:r>
@@ -704,6 +731,7 @@
       <w:r>
         <w:rPr>
           <w:b/>
+          <w:bCs/>
         </w:rPr>
         <w:t xml:space="preserve">Ends</w:t>
       </w:r>
@@ -725,6 +753,7 @@
       <w:r>
         <w:rPr>
           <w:b/>
+          <w:bCs/>
         </w:rPr>
         <w:t xml:space="preserve">Repeat</w:t>
       </w:r>
@@ -734,6 +763,7 @@
       <w:r>
         <w:rPr>
           <w:b/>
+          <w:bCs/>
         </w:rPr>
         <w:t xml:space="preserve">Does not repeat</w:t>
       </w:r>
@@ -752,6 +782,7 @@
       <w:r>
         <w:rPr>
           <w:b/>
+          <w:bCs/>
         </w:rPr>
         <w:t xml:space="preserve">Alarm:</w:t>
       </w:r>
@@ -761,6 +792,7 @@
       <w:r>
         <w:rPr>
           <w:b/>
+          <w:bCs/>
         </w:rPr>
         <w:t xml:space="preserve">1 hour before</w:t>
       </w:r>
@@ -782,6 +814,7 @@
       <w:r>
         <w:rPr>
           <w:b/>
+          <w:bCs/>
         </w:rPr>
         <w:t xml:space="preserve">Category</w:t>
       </w:r>
@@ -800,6 +833,7 @@
       <w:r>
         <w:rPr>
           <w:b/>
+          <w:bCs/>
         </w:rPr>
         <w:t xml:space="preserve">Location</w:t>
       </w:r>
@@ -818,6 +852,7 @@
       <w:r>
         <w:rPr>
           <w:b/>
+          <w:bCs/>
         </w:rPr>
         <w:t xml:space="preserve">Notes</w:t>
       </w:r>
@@ -848,6 +883,7 @@
       <w:r>
         <w:rPr>
           <w:b/>
+          <w:bCs/>
         </w:rPr>
         <w:t xml:space="preserve">Save</w:t>
       </w:r>
@@ -857,6 +893,7 @@
       <w:r>
         <w:rPr>
           <w:b/>
+          <w:bCs/>
         </w:rPr>
         <w:t xml:space="preserve">Ctrl+S</w:t>
       </w:r>
@@ -925,6 +962,7 @@
       <w:r>
         <w:rPr>
           <w:i/>
+          <w:iCs/>
         </w:rPr>
         <w:t xml:space="preserve">Pay the hydro bill on the 5th of every month, reminded the day before at 9:00 AM.</w:t>
       </w:r>
@@ -943,6 +981,7 @@
       <w:r>
         <w:rPr>
           <w:b/>
+          <w:bCs/>
         </w:rPr>
         <w:t xml:space="preserve">＋ Reminder</w:t>
       </w:r>
@@ -961,6 +1000,7 @@
       <w:r>
         <w:rPr>
           <w:b/>
+          <w:bCs/>
         </w:rPr>
         <w:t xml:space="preserve">Description:</w:t>
       </w:r>
@@ -988,6 +1028,7 @@
       <w:r>
         <w:rPr>
           <w:b/>
+          <w:bCs/>
         </w:rPr>
         <w:t xml:space="preserve">Date:</w:t>
       </w:r>
@@ -997,6 +1038,7 @@
       <w:r>
         <w:rPr>
           <w:b/>
+          <w:bCs/>
         </w:rPr>
         <w:t xml:space="preserve">All day</w:t>
       </w:r>
@@ -1015,6 +1057,7 @@
       <w:r>
         <w:rPr>
           <w:b/>
+          <w:bCs/>
         </w:rPr>
         <w:t xml:space="preserve">Repeat:</w:t>
       </w:r>
@@ -1024,6 +1067,7 @@
       <w:r>
         <w:rPr>
           <w:b/>
+          <w:bCs/>
         </w:rPr>
         <w:t xml:space="preserve">Monthly</w:t>
       </w:r>
@@ -1033,6 +1077,7 @@
       <w:r>
         <w:rPr>
           <w:b/>
+          <w:bCs/>
         </w:rPr>
         <w:t xml:space="preserve">1</w:t>
       </w:r>
@@ -1042,6 +1087,7 @@
       <w:r>
         <w:rPr>
           <w:b/>
+          <w:bCs/>
         </w:rPr>
         <w:t xml:space="preserve">On:</w:t>
       </w:r>
@@ -1051,6 +1097,7 @@
       <w:r>
         <w:rPr>
           <w:b/>
+          <w:bCs/>
         </w:rPr>
         <w:t xml:space="preserve">Ends:</w:t>
       </w:r>
@@ -1069,6 +1116,7 @@
       <w:r>
         <w:rPr>
           <w:b/>
+          <w:bCs/>
         </w:rPr>
         <w:t xml:space="preserve">Alarm:</w:t>
       </w:r>
@@ -1078,6 +1126,7 @@
       <w:r>
         <w:rPr>
           <w:b/>
+          <w:bCs/>
         </w:rPr>
         <w:t xml:space="preserve">Remind me…</w:t>
       </w:r>
@@ -1087,6 +1136,7 @@
       <w:r>
         <w:rPr>
           <w:b/>
+          <w:bCs/>
         </w:rPr>
         <w:t xml:space="preserve">1 day before</w:t>
       </w:r>
@@ -1096,6 +1146,7 @@
       <w:r>
         <w:rPr>
           <w:b/>
+          <w:bCs/>
         </w:rPr>
         <w:t xml:space="preserve">9:00 AM</w:t>
       </w:r>
@@ -1117,6 +1168,7 @@
       <w:r>
         <w:rPr>
           <w:b/>
+          <w:bCs/>
         </w:rPr>
         <w:t xml:space="preserve">Remind me daily until completed</w:t>
       </w:r>
@@ -1135,6 +1187,7 @@
       <w:r>
         <w:rPr>
           <w:b/>
+          <w:bCs/>
         </w:rPr>
         <w:t xml:space="preserve">Category:</w:t>
       </w:r>
@@ -1153,6 +1206,7 @@
       <w:r>
         <w:rPr>
           <w:b/>
+          <w:bCs/>
         </w:rPr>
         <w:t xml:space="preserve">Save</w:t>
       </w:r>
@@ -1204,6 +1258,7 @@
       <w:r>
         <w:rPr>
           <w:b/>
+          <w:bCs/>
         </w:rPr>
         <w:t xml:space="preserve">Show → All reminders</w:t>
       </w:r>
@@ -1213,6 +1268,7 @@
       <w:r>
         <w:rPr>
           <w:b/>
+          <w:bCs/>
         </w:rPr>
         <w:t xml:space="preserve">Past</w:t>
       </w:r>
@@ -1454,6 +1510,7 @@
       <w:r>
         <w:rPr>
           <w:b/>
+          <w:bCs/>
         </w:rPr>
         <w:t xml:space="preserve">Snooze:</w:t>
       </w:r>
@@ -1463,6 +1520,7 @@
       <w:r>
         <w:rPr>
           <w:b/>
+          <w:bCs/>
         </w:rPr>
         <w:t xml:space="preserve">until…</w:t>
       </w:r>
@@ -1490,6 +1548,7 @@
       <w:r>
         <w:rPr>
           <w:b/>
+          <w:bCs/>
         </w:rPr>
         <w:t xml:space="preserve">Done:</w:t>
       </w:r>
@@ -1508,6 +1567,7 @@
       <w:r>
         <w:rPr>
           <w:b/>
+          <w:bCs/>
         </w:rPr>
         <w:t xml:space="preserve">Open:</w:t>
       </w:r>
@@ -1526,6 +1586,7 @@
       <w:r>
         <w:rPr>
           <w:b/>
+          <w:bCs/>
         </w:rPr>
         <w:t xml:space="preserve">Dismiss:</w:t>
       </w:r>
@@ -1544,6 +1605,7 @@
       <w:r>
         <w:rPr>
           <w:b/>
+          <w:bCs/>
         </w:rPr>
         <w:t xml:space="preserve">Worth setting up next</w:t>
       </w:r>
@@ -1609,6 +1671,7 @@
             <w:r>
               <w:rPr>
                 <w:b/>
+                <w:bCs/>
               </w:rPr>
               <w:t xml:space="preserve">＋ List Item</w:t>
             </w:r>
@@ -1642,6 +1705,7 @@
             <w:r>
               <w:rPr>
                 <w:b/>
+                <w:bCs/>
               </w:rPr>
               <w:t xml:space="preserve">List dropdown</w:t>
             </w:r>
@@ -1651,6 +1715,7 @@
             <w:r>
               <w:rPr>
                 <w:b/>
+                <w:bCs/>
               </w:rPr>
               <w:t xml:space="preserve">＋ New list…</w:t>
             </w:r>
@@ -1678,6 +1743,7 @@
             <w:r>
               <w:rPr>
                 <w:b/>
+                <w:bCs/>
               </w:rPr>
               <w:t xml:space="preserve">⏰ Quick alarm</w:t>
             </w:r>
@@ -1708,6 +1774,7 @@
             <w:r>
               <w:rPr>
                 <w:b/>
+                <w:bCs/>
               </w:rPr>
               <w:t xml:space="preserve">Settings → General / Display</w:t>
             </w:r>
@@ -1735,6 +1802,7 @@
             <w:r>
               <w:rPr>
                 <w:b/>
+                <w:bCs/>
               </w:rPr>
               <w:t xml:space="preserve">Settings → Display → Language</w:t>
             </w:r>
@@ -1762,6 +1830,7 @@
             <w:r>
               <w:rPr>
                 <w:b/>
+                <w:bCs/>
               </w:rPr>
               <w:t xml:space="preserve">Settings → Display → Columns; Show completed in each toolbar</w:t>
             </w:r>
@@ -1789,6 +1858,7 @@
             <w:r>
               <w:rPr>
                 <w:b/>
+                <w:bCs/>
               </w:rPr>
               <w:t xml:space="preserve">Settings → Alarms</w:t>
             </w:r>
@@ -1816,6 +1886,7 @@
             <w:r>
               <w:rPr>
                 <w:b/>
+                <w:bCs/>
               </w:rPr>
               <w:t xml:space="preserve">Settings → Data → Back up now</w:t>
             </w:r>
@@ -2088,7 +2159,9 @@
     </w:pPr>
     <w:rPr>
       <w:b/>
+      <w:bCs/>
       <w:sz w:val="32"/>
+      <w:szCs w:val="32"/>
     </w:rPr>
   </w:style>
   <w:style w:type="paragraph" w:styleId="Heading2">
@@ -2103,7 +2176,9 @@
     </w:pPr>
     <w:rPr>
       <w:b/>
+      <w:bCs/>
       <w:sz w:val="26"/>
+      <w:szCs w:val="26"/>
     </w:rPr>
   </w:style>
   <w:style w:type="paragraph" w:styleId="Heading3">
@@ -2118,7 +2193,9 @@
     </w:pPr>
     <w:rPr>
       <w:b/>
+      <w:bCs/>
       <w:sz w:val="24"/>
+      <w:szCs w:val="24"/>
     </w:rPr>
   </w:style>
   <w:style w:type="paragraph" w:styleId="Heading4">
@@ -2132,7 +2209,9 @@
     </w:pPr>
     <w:rPr>
       <w:b/>
+      <w:bCs/>
       <w:sz w:val="22"/>
+      <w:szCs w:val="22"/>
     </w:rPr>
   </w:style>
   <w:style w:type="paragraph" w:styleId="Heading5">
@@ -2146,7 +2225,9 @@
     </w:pPr>
     <w:rPr>
       <w:b/>
+      <w:bCs/>
       <w:sz w:val="22"/>
+      <w:szCs w:val="22"/>
     </w:rPr>
   </w:style>
   <w:style w:type="paragraph" w:styleId="Heading6">
@@ -2160,7 +2241,9 @@
     </w:pPr>
     <w:rPr>
       <w:i/>
+      <w:iCs/>
       <w:sz w:val="22"/>
+      <w:szCs w:val="22"/>
     </w:rPr>
   </w:style>
   <w:style w:type="paragraph" w:styleId="Title">
@@ -2174,6 +2257,7 @@
     </w:pPr>
     <w:rPr>
       <w:sz w:val="56"/>
+      <w:szCs w:val="56"/>
     </w:rPr>
   </w:style>
   <w:style w:type="paragraph" w:styleId="Quote">
@@ -2188,6 +2272,7 @@
     </w:pPr>
     <w:rPr>
       <w:i/>
+      <w:iCs/>
       <w:color w:val="404040"/>
     </w:rPr>
   </w:style>
@@ -2203,6 +2288,7 @@
     <w:rPr>
       <w:rFonts w:ascii="Consolas" w:hAnsi="Consolas" w:eastAsia="Consolas" w:cs="Consolas"/>
       <w:sz w:val="20"/>
+      <w:szCs w:val="20"/>
     </w:rPr>
   </w:style>
   <w:style w:type="character" w:styleId="CodeChar">
@@ -2211,6 +2297,7 @@
     <w:rPr>
       <w:rFonts w:ascii="Consolas" w:hAnsi="Consolas" w:eastAsia="Consolas" w:cs="Consolas"/>
       <w:sz w:val="20"/>
+      <w:szCs w:val="20"/>
       <w:shd w:val="clear" w:color="auto" w:fill="F5F5F5"/>
     </w:rPr>
   </w:style>

</xml_diff>